<commit_message>
Consistency guard, client message, custom templates, Template Studio analyst, reviewer agent, amount-in-words
Co-Authored-By: Claude Sonnet 5.5 <noreply@anthropic.com>
</commit_message>
<xml_diff>
--- a/backend/app/templates/files/rental_agreement__1.0.docx
+++ b/backend/app/templates/files/rental_agreement__1.0.docx
@@ -258,7 +258,7 @@
           <w:color w:val="1B1A17"/>
           <w:sz w:val="22"/>
         </w:rPr>
-        <w:t>2. Monthly rent is {{ monthly_rent }}, payable by day {{ rent_due_day }} of each month.</w:t>
+        <w:t>2. Monthly rent is {{ monthly_rent }} ({{ monthly_rent_words }}), payable by day {{ rent_due_day }} of each month.</w:t>
       </w:r>
     </w:p>
     <w:p>
@@ -270,7 +270,7 @@
           <w:color w:val="1B1A17"/>
           <w:sz w:val="22"/>
         </w:rPr>
-        <w:t>3. Security deposit is {{ security_deposit }}. Total payable at the start is {{ first_payment_total }}.</w:t>
+        <w:t>3. Security deposit is {{ security_deposit }} ({{ security_deposit_words }}). Total payable at the start is {{ first_payment_total }} ({{ first_payment_total_words }}).</w:t>
       </w:r>
     </w:p>
     <w:p>
@@ -287,7 +287,7 @@
     </w:p>
     <w:p>
       <w:r>
-        <w:t>{%p if furnished %}</w:t>
+        <w:t>{%p if furnished_flag %}</w:t>
       </w:r>
     </w:p>
     <w:p>

</xml_diff>